<commit_message>
Complete data preprocess 20260615 + EDA_1 20260616 cascade/counter-cascade metrics
</commit_message>
<xml_diff>
--- a/feedback/Conceptual_Framework_AD.docx
+++ b/feedback/Conceptual_Framework_AD.docx
@@ -119,21 +119,20 @@
           <w:rFonts w:cstheme="majorHAnsi"/>
         </w:rPr>
       </w:pPr>
+      <w:r>
+        <w:rPr>
+          <w:rFonts w:cstheme="majorHAnsi"/>
+        </w:rPr>
+        <w:t xml:space="preserve">Despite this theoretical complexity, existing quantitative studies of neighbourhood change in London, including Yee and Dennett (2022) and subsequent extension by Hong and Dennett (2023), primarily conceptualise restructuring through changes in neighbourhood attributes such as housing prices, occupational composition, demographic transition, and </w:t>
+      </w:r>
       <w:commentRangeStart w:id="1"/>
       <w:r>
         <w:rPr>
           <w:rFonts w:cstheme="majorHAnsi"/>
         </w:rPr>
-        <w:t xml:space="preserve">Despite this theoretical complexity, existing quantitative studies of neighbourhood change in London, including Yee and Dennett (2022) and subsequent extension by Hong and Dennett (2023), primarily conceptualise restructuring through changes in neighbourhood attributes such as housing prices, occupational composition, demographic transition, and </w:t>
-      </w:r>
-      <w:commentRangeStart w:id="2"/>
-      <w:r>
-        <w:rPr>
-          <w:rFonts w:cstheme="majorHAnsi"/>
-        </w:rPr>
         <w:t>residential turnover</w:t>
       </w:r>
-      <w:commentRangeEnd w:id="2"/>
+      <w:commentRangeEnd w:id="1"/>
       <w:r>
         <w:rPr>
           <w:rStyle w:val="CommentReference"/>
@@ -141,22 +140,36 @@
           <w:sz w:val="24"/>
           <w:szCs w:val="24"/>
         </w:rPr>
-        <w:commentReference w:id="2"/>
-      </w:r>
-      <w:r>
-        <w:rPr>
-          <w:rFonts w:cstheme="majorHAnsi"/>
-        </w:rPr>
-        <w:t xml:space="preserve">. These approaches primarily capture the outcomes of neighbourhood restructuring once socio-economic upgrading becomes observable in the characteristics of places and populations. Because attribute-level upgrading may lag behind underlying migration restructuring processes, areas experiencing </w:t>
-      </w:r>
-      <w:commentRangeStart w:id="3"/>
+        <w:commentReference w:id="1"/>
+      </w:r>
+      <w:r>
+        <w:rPr>
+          <w:rFonts w:cstheme="majorHAnsi"/>
+        </w:rPr>
+        <w:t xml:space="preserve">. These approaches primarily capture the outcomes of neighbourhood restructuring once socio-economic upgrading becomes observable in the characteristics of places and populations. Because attribute-level upgrading may </w:t>
+      </w:r>
+      <w:proofErr w:type="gramStart"/>
+      <w:r>
+        <w:rPr>
+          <w:rFonts w:cstheme="majorHAnsi"/>
+        </w:rPr>
+        <w:t>lag behind</w:t>
+      </w:r>
+      <w:proofErr w:type="gramEnd"/>
+      <w:r>
+        <w:rPr>
+          <w:rFonts w:cstheme="majorHAnsi"/>
+        </w:rPr>
+        <w:t xml:space="preserve"> underlying migration restructuring processes, areas experiencing </w:t>
+      </w:r>
+      <w:commentRangeStart w:id="2"/>
       <w:r>
         <w:rPr>
           <w:rFonts w:cstheme="majorHAnsi"/>
         </w:rPr>
         <w:t>asymmetric inflows from less deprived neighbourhoods alongside disproportionate outflows toward more deprived areas may not yet exhibit sufficiently visible socio-economic transformation to register within conventional gentrification classifications</w:t>
       </w:r>
-      <w:commentRangeEnd w:id="3"/>
+      <w:commentRangeEnd w:id="2"/>
       <w:r>
         <w:rPr>
           <w:rStyle w:val="CommentReference"/>
@@ -164,7 +177,7 @@
           <w:sz w:val="24"/>
           <w:szCs w:val="24"/>
         </w:rPr>
-        <w:commentReference w:id="3"/>
+        <w:commentReference w:id="2"/>
       </w:r>
       <w:r>
         <w:rPr>
@@ -172,28 +185,46 @@
         </w:rPr>
         <w:t>.</w:t>
       </w:r>
-      <w:commentRangeEnd w:id="1"/>
-      <w:r>
-        <w:rPr>
-          <w:rStyle w:val="CommentReference"/>
-          <w:rFonts w:cstheme="majorHAnsi"/>
-          <w:sz w:val="24"/>
-          <w:szCs w:val="24"/>
-        </w:rPr>
-        <w:commentReference w:id="1"/>
-      </w:r>
-    </w:p>
-    <w:p>
-      <w:pPr>
-        <w:rPr>
-          <w:rFonts w:cstheme="majorHAnsi"/>
-        </w:rPr>
-      </w:pPr>
-      <w:r>
-        <w:rPr>
-          <w:rFonts w:cstheme="majorHAnsi"/>
-        </w:rPr>
-        <w:t>To address this methodological gap, this study develops a flow-centred framework  across London’s socio-economic hierarchy designed to identify restructuring pressures  prior to their full materialisation in neighbourhood composition. Specifically, the framework conceptualises displacement pressure as a relational mobility structure observable through asymmetric migration flows between neighbourhoods positioned differently within the urban deprivation hierarchy. As illustrated in the diagram, this framework translates structural urban processes (e.g. gentrification) into empirically observable migration patterns that can subsequently be evaluated against independent measures of neighbourhood socio-economic change.</w:t>
+    </w:p>
+    <w:p>
+      <w:pPr>
+        <w:rPr>
+          <w:rFonts w:cstheme="majorHAnsi"/>
+        </w:rPr>
+      </w:pPr>
+      <w:r>
+        <w:rPr>
+          <w:rFonts w:cstheme="majorHAnsi"/>
+        </w:rPr>
+        <w:t xml:space="preserve">To address this methodological gap, this study develops a flow-centred </w:t>
+      </w:r>
+      <w:proofErr w:type="gramStart"/>
+      <w:r>
+        <w:rPr>
+          <w:rFonts w:cstheme="majorHAnsi"/>
+        </w:rPr>
+        <w:t>framework  across</w:t>
+      </w:r>
+      <w:proofErr w:type="gramEnd"/>
+      <w:r>
+        <w:rPr>
+          <w:rFonts w:cstheme="majorHAnsi"/>
+        </w:rPr>
+        <w:t xml:space="preserve"> London’s socio-economic hierarchy designed to identify restructuring </w:t>
+      </w:r>
+      <w:proofErr w:type="gramStart"/>
+      <w:r>
+        <w:rPr>
+          <w:rFonts w:cstheme="majorHAnsi"/>
+        </w:rPr>
+        <w:t>pressures  prior</w:t>
+      </w:r>
+      <w:proofErr w:type="gramEnd"/>
+      <w:r>
+        <w:rPr>
+          <w:rFonts w:cstheme="majorHAnsi"/>
+        </w:rPr>
+        <w:t xml:space="preserve"> to their full materialisation in neighbourhood composition. Specifically, the framework conceptualises displacement pressure as a relational mobility structure observable through asymmetric migration flows between neighbourhoods positioned differently within the urban deprivation hierarchy. As illustrated in the diagram, this framework translates structural urban processes (e.g. gentrification) into empirically observable migration patterns that can subsequently be evaluated against independent measures of neighbourhood socio-economic change.</w:t>
       </w:r>
     </w:p>
     <w:p>
@@ -205,8 +236,8 @@
           <w:color w:val="000000"/>
         </w:rPr>
       </w:pPr>
-      <w:bookmarkStart w:id="4" w:name="_vkivlie67bx0" w:colFirst="0" w:colLast="0"/>
-      <w:bookmarkEnd w:id="4"/>
+      <w:bookmarkStart w:id="3" w:name="_vkivlie67bx0" w:colFirst="0" w:colLast="0"/>
+      <w:bookmarkEnd w:id="3"/>
       <w:r>
         <w:rPr>
           <w:rFonts w:cstheme="majorHAnsi"/>
@@ -269,14 +300,14 @@
         </w:rPr>
         <w:t xml:space="preserve">The deprivation hierarchy conditions the spatial pathways through which displacement-related mobility may occur. Population movements are therefore not treated as spatially random, but as structured by directional relationship across the urban socio-economic gradient. Within this framework, the deprivation hierarchy functions not merely as a descriptive classification system, but as the broader structural field through which </w:t>
       </w:r>
-      <w:commentRangeStart w:id="5"/>
+      <w:commentRangeStart w:id="4"/>
       <w:r>
         <w:rPr>
           <w:rFonts w:cstheme="majorHAnsi"/>
         </w:rPr>
         <w:t>cascading</w:t>
       </w:r>
-      <w:commentRangeEnd w:id="5"/>
+      <w:commentRangeEnd w:id="4"/>
       <w:r>
         <w:rPr>
           <w:rStyle w:val="CommentReference"/>
@@ -284,7 +315,7 @@
           <w:sz w:val="24"/>
           <w:szCs w:val="24"/>
         </w:rPr>
-        <w:commentReference w:id="5"/>
+        <w:commentReference w:id="4"/>
       </w:r>
       <w:r>
         <w:rPr>
@@ -302,8 +333,8 @@
           <w:color w:val="000000"/>
         </w:rPr>
       </w:pPr>
-      <w:bookmarkStart w:id="6" w:name="_gom5oqqwyek3" w:colFirst="0" w:colLast="0"/>
-      <w:bookmarkEnd w:id="6"/>
+      <w:bookmarkStart w:id="5" w:name="_gom5oqqwyek3" w:colFirst="0" w:colLast="0"/>
+      <w:bookmarkEnd w:id="5"/>
       <w:r>
         <w:rPr>
           <w:rFonts w:cstheme="majorHAnsi"/>
@@ -320,7 +351,7 @@
           <w:rFonts w:cstheme="majorHAnsi"/>
         </w:rPr>
       </w:pPr>
-      <w:commentRangeStart w:id="7"/>
+      <w:commentRangeStart w:id="6"/>
       <w:r>
         <w:rPr>
           <w:rFonts w:cstheme="majorHAnsi"/>
@@ -337,9 +368,23 @@
         <w:rPr>
           <w:rFonts w:cstheme="majorHAnsi"/>
         </w:rPr>
-        <w:t>Using Census origin-destination migration data, this study analyses flows between neighbourhoods relative to a fixed deprivation baseline in order to identify directional migration asymmetries across London’s socio-economic structure.</w:t>
-      </w:r>
-      <w:commentRangeEnd w:id="7"/>
+        <w:t xml:space="preserve">Using Census origin-destination migration data, this study analyses flows between neighbourhoods relative to a fixed deprivation baseline </w:t>
+      </w:r>
+      <w:proofErr w:type="gramStart"/>
+      <w:r>
+        <w:rPr>
+          <w:rFonts w:cstheme="majorHAnsi"/>
+        </w:rPr>
+        <w:t>in order to</w:t>
+      </w:r>
+      <w:proofErr w:type="gramEnd"/>
+      <w:r>
+        <w:rPr>
+          <w:rFonts w:cstheme="majorHAnsi"/>
+        </w:rPr>
+        <w:t xml:space="preserve"> identify directional migration asymmetries across London’s socio-economic structure.</w:t>
+      </w:r>
+      <w:commentRangeEnd w:id="6"/>
       <w:r>
         <w:rPr>
           <w:rStyle w:val="CommentReference"/>
@@ -347,31 +392,31 @@
           <w:sz w:val="24"/>
           <w:szCs w:val="24"/>
         </w:rPr>
-        <w:commentReference w:id="7"/>
-      </w:r>
-    </w:p>
-    <w:p>
-      <w:pPr>
-        <w:rPr>
-          <w:rFonts w:cstheme="majorHAnsi"/>
-        </w:rPr>
-      </w:pPr>
-    </w:p>
-    <w:p>
-      <w:pPr>
-        <w:rPr>
-          <w:rFonts w:cstheme="majorHAnsi"/>
-        </w:rPr>
-      </w:pPr>
+        <w:commentReference w:id="6"/>
+      </w:r>
+    </w:p>
+    <w:p>
+      <w:pPr>
+        <w:rPr>
+          <w:rFonts w:cstheme="majorHAnsi"/>
+        </w:rPr>
+      </w:pPr>
+    </w:p>
+    <w:p>
+      <w:pPr>
+        <w:rPr>
+          <w:rFonts w:cstheme="majorHAnsi"/>
+        </w:rPr>
+      </w:pPr>
+      <w:commentRangeStart w:id="7"/>
       <w:commentRangeStart w:id="8"/>
-      <w:commentRangeStart w:id="9"/>
       <w:r>
         <w:rPr>
           <w:rFonts w:cstheme="majorHAnsi"/>
         </w:rPr>
         <w:t>Within this framework, inflows from less deprived neighbourhoods and outflows toward more deprived neighbourhoods represent distinct directional movements across urban hierarchy. The simultaneous co-occurrence of these asymmetric flows constitutes the empirical signature of cascading mobility structures associated with residential restructuring.</w:t>
       </w:r>
-      <w:commentRangeEnd w:id="8"/>
+      <w:commentRangeEnd w:id="7"/>
       <w:r>
         <w:rPr>
           <w:rStyle w:val="CommentReference"/>
@@ -379,9 +424,9 @@
           <w:sz w:val="24"/>
           <w:szCs w:val="24"/>
         </w:rPr>
-        <w:commentReference w:id="8"/>
-      </w:r>
-      <w:commentRangeEnd w:id="9"/>
+        <w:commentReference w:id="7"/>
+      </w:r>
+      <w:commentRangeEnd w:id="8"/>
       <w:r>
         <w:rPr>
           <w:rStyle w:val="CommentReference"/>
@@ -389,30 +434,30 @@
           <w:sz w:val="24"/>
           <w:szCs w:val="24"/>
         </w:rPr>
-        <w:commentReference w:id="9"/>
-      </w:r>
-    </w:p>
-    <w:p>
-      <w:pPr>
-        <w:rPr>
-          <w:rFonts w:cstheme="majorHAnsi"/>
-        </w:rPr>
-      </w:pPr>
-    </w:p>
-    <w:p>
-      <w:pPr>
-        <w:rPr>
-          <w:rFonts w:cstheme="majorHAnsi"/>
-        </w:rPr>
-      </w:pPr>
-      <w:commentRangeStart w:id="10"/>
+        <w:commentReference w:id="8"/>
+      </w:r>
+    </w:p>
+    <w:p>
+      <w:pPr>
+        <w:rPr>
+          <w:rFonts w:cstheme="majorHAnsi"/>
+        </w:rPr>
+      </w:pPr>
+    </w:p>
+    <w:p>
+      <w:pPr>
+        <w:rPr>
+          <w:rFonts w:cstheme="majorHAnsi"/>
+        </w:rPr>
+      </w:pPr>
+      <w:commentRangeStart w:id="9"/>
       <w:r>
         <w:rPr>
           <w:rFonts w:cstheme="majorHAnsi"/>
         </w:rPr>
         <w:t>Rather than observing displacement directly, the framework identifies aggregate migration patterns consistent with cascading displacement dynamics operating at neighbourhood scale. Residential restructuring is therefore conceptualised as an empirically observable redistribution of population across the depreciation hierarchy, manifested through the concentration, circulation, or dispersal of socio-economic advantage and disadvantage between neighbourhoods.</w:t>
       </w:r>
-      <w:commentRangeEnd w:id="10"/>
+      <w:commentRangeEnd w:id="9"/>
       <w:r>
         <w:rPr>
           <w:rStyle w:val="CommentReference"/>
@@ -420,7 +465,7 @@
           <w:sz w:val="24"/>
           <w:szCs w:val="24"/>
         </w:rPr>
-        <w:commentReference w:id="10"/>
+        <w:commentReference w:id="9"/>
       </w:r>
     </w:p>
     <w:p>
@@ -452,8 +497,8 @@
           <w:color w:val="000000"/>
         </w:rPr>
       </w:pPr>
-      <w:bookmarkStart w:id="11" w:name="_k5lcvqnrse0w" w:colFirst="0" w:colLast="0"/>
-      <w:bookmarkEnd w:id="11"/>
+      <w:bookmarkStart w:id="10" w:name="_k5lcvqnrse0w" w:colFirst="0" w:colLast="0"/>
+      <w:bookmarkEnd w:id="10"/>
       <w:r>
         <w:rPr>
           <w:rFonts w:cstheme="majorHAnsi"/>
@@ -543,14 +588,14 @@
           <w:rFonts w:cstheme="majorHAnsi"/>
         </w:rPr>
       </w:pPr>
-      <w:commentRangeStart w:id="12"/>
+      <w:commentRangeStart w:id="11"/>
       <w:r>
         <w:rPr>
           <w:rFonts w:cstheme="majorHAnsi"/>
         </w:rPr>
         <w:t xml:space="preserve">Displacement pressure extends beyond households that have already moved by altering affordability, accessibility, and social conditions of neighbourhood life. Because these pressures operate structurally and cumulatively, they are more likely to generate observable migration asymmetries and cascading mobility structures within aggregate origin-destination data. </w:t>
       </w:r>
-      <w:commentRangeEnd w:id="12"/>
+      <w:commentRangeEnd w:id="11"/>
       <w:r>
         <w:rPr>
           <w:rStyle w:val="CommentReference"/>
@@ -558,7 +603,7 @@
           <w:sz w:val="24"/>
           <w:szCs w:val="24"/>
         </w:rPr>
-        <w:commentReference w:id="12"/>
+        <w:commentReference w:id="11"/>
       </w:r>
       <w:r>
         <w:rPr>
@@ -576,8 +621,8 @@
           <w:color w:val="000000"/>
         </w:rPr>
       </w:pPr>
-      <w:bookmarkStart w:id="13" w:name="_tm90obrhi30e" w:colFirst="0" w:colLast="0"/>
-      <w:bookmarkEnd w:id="13"/>
+      <w:bookmarkStart w:id="12" w:name="_tm90obrhi30e" w:colFirst="0" w:colLast="0"/>
+      <w:bookmarkEnd w:id="12"/>
       <w:r>
         <w:rPr>
           <w:rFonts w:cstheme="majorHAnsi"/>
@@ -717,7 +762,7 @@
       </w:r>
     </w:p>
   </w:comment>
-  <w:comment w:id="2" w:author="Adam Dennett" w:date="2026-06-03T18:58:00Z" w:initials="AD">
+  <w:comment w:id="1" w:author="Adam Dennett" w:date="2026-06-03T18:58:00Z" w:initials="AD">
     <w:p>
       <w:pPr>
         <w:pStyle w:val="CommentText"/>
@@ -733,7 +778,7 @@
       </w:r>
     </w:p>
   </w:comment>
-  <w:comment w:id="3" w:author="Adam Dennett" w:date="2026-06-03T18:59:00Z" w:initials="AD">
+  <w:comment w:id="2" w:author="Adam Dennett" w:date="2026-06-03T18:59:00Z" w:initials="AD">
     <w:p>
       <w:pPr>
         <w:pStyle w:val="CommentText"/>
@@ -749,21 +794,10 @@
       </w:r>
     </w:p>
   </w:comment>
-  <w:comment w:id="1" w:author="Yujing Xing" w:date="2026-05-30T14:40:00Z" w:initials="">
-    <w:p>
-      <w:pPr>
-        <w:widowControl w:val="0"/>
-        <w:pBdr>
-          <w:top w:val="nil"/>
-          <w:left w:val="nil"/>
-          <w:bottom w:val="nil"/>
-          <w:right w:val="nil"/>
-          <w:between w:val="nil"/>
-        </w:pBdr>
-        <w:spacing w:line="240" w:lineRule="auto"/>
-        <w:rPr>
-          <w:color w:val="000000"/>
-        </w:rPr>
+  <w:comment w:id="4" w:author="Adam Dennett" w:date="2026-06-03T19:20:00Z" w:initials="AD">
+    <w:p>
+      <w:pPr>
+        <w:pStyle w:val="CommentText"/>
       </w:pPr>
       <w:r>
         <w:rPr>
@@ -772,17 +806,11 @@
         <w:annotationRef/>
       </w:r>
       <w:r>
-        <w:rPr>
-          <w:rFonts w:ascii="Arial" w:eastAsia="Arial" w:hAnsi="Arial" w:cs="Arial"/>
-          <w:color w:val="000000"/>
-          <w:sz w:val="22"/>
-          <w:szCs w:val="22"/>
-        </w:rPr>
-        <w:t>Mainly rewrote this part to explicitly point out the comparison between attribute change and flow restructuring.</w:t>
+        <w:t>You might want to clarify what you mean by cascading here - diagram could help too</w:t>
       </w:r>
     </w:p>
   </w:comment>
-  <w:comment w:id="5" w:author="Adam Dennett" w:date="2026-06-03T19:20:00Z" w:initials="AD">
+  <w:comment w:id="6" w:author="Adam Dennett" w:date="2026-06-03T19:22:00Z" w:initials="AD">
     <w:p>
       <w:pPr>
         <w:pStyle w:val="CommentText"/>
@@ -794,11 +822,11 @@
         <w:annotationRef/>
       </w:r>
       <w:r>
-        <w:t>You might want to clarify what you mean by cascading here - diagram could help too</w:t>
+        <w:t>Thing to think about here - how much detail do you want. For example, are 10 IMD deciles going to give too much detail when looking at migration up and down? Would three (low, medium, high) me more likely to produce a signal? Maybe start with 10, but if the signal gets confused, perhaps aggregate to something a little coarser</w:t>
       </w:r>
     </w:p>
   </w:comment>
-  <w:comment w:id="7" w:author="Adam Dennett" w:date="2026-06-03T19:22:00Z" w:initials="AD">
+  <w:comment w:id="7" w:author="Adam Dennett" w:date="2026-06-03T19:19:00Z" w:initials="AD">
     <w:p>
       <w:pPr>
         <w:pStyle w:val="CommentText"/>
@@ -810,11 +838,11 @@
         <w:annotationRef/>
       </w:r>
       <w:r>
-        <w:t>Thing to think about here - how much detail do you want. For example, are 10 IMD deciles going to give too much detail when looking at migration up and down? Would three (low, medium, high) me more likely to produce a signal? Maybe start with 10, but if the signal gets confused, perhaps aggregate to something a little coarser</w:t>
+        <w:t xml:space="preserve">I guess here you could have a matrix of type flows - 1) less to move deprived 2) more to less deprived 3) less to less deprived (horizontal) 4) more to more deprived (horizontal). </w:t>
       </w:r>
     </w:p>
   </w:comment>
-  <w:comment w:id="8" w:author="Adam Dennett" w:date="2026-06-03T19:19:00Z" w:initials="AD">
+  <w:comment w:id="8" w:author="Adam Dennett" w:date="2026-06-03T19:24:00Z" w:initials="AD">
     <w:p>
       <w:pPr>
         <w:pStyle w:val="CommentText"/>
@@ -826,11 +854,11 @@
         <w:annotationRef/>
       </w:r>
       <w:r>
-        <w:t xml:space="preserve">I guess here you could have a matrix of type flows - 1) less to move deprived 2) more to less deprived 3) less to less deprived (horizontal) 4) more to more deprived (horizontal). </w:t>
+        <w:t>You might also want to be clear about which of these you think relates to gentrification. Are we saying inflows from more to less and outflow from less to less are the classic gentrification bump? However you define it - link it back to the literature for justification</w:t>
       </w:r>
     </w:p>
   </w:comment>
-  <w:comment w:id="9" w:author="Adam Dennett" w:date="2026-06-03T19:24:00Z" w:initials="AD">
+  <w:comment w:id="9" w:author="Adam Dennett" w:date="2026-06-03T19:25:00Z" w:initials="AD">
     <w:p>
       <w:pPr>
         <w:pStyle w:val="CommentText"/>
@@ -842,30 +870,17 @@
         <w:annotationRef/>
       </w:r>
       <w:r>
-        <w:t>You might also want to be clear about which of these you think relates to gentrification. Are we saying inflows from more to less and outflow from less to less are the classic gentrification bump? However you define it - link it back to the literature for justification</w:t>
+        <w:t>A diagram would be great here</w:t>
       </w:r>
     </w:p>
   </w:comment>
-  <w:comment w:id="10" w:author="Adam Dennett" w:date="2026-06-03T19:25:00Z" w:initials="AD">
+  <w:comment w:id="11" w:author="Adam Dennett" w:date="2026-06-03T19:30:00Z" w:initials="AD">
     <w:p>
       <w:pPr>
         <w:pStyle w:val="CommentText"/>
-      </w:pPr>
-      <w:r>
-        <w:rPr>
-          <w:rStyle w:val="CommentReference"/>
-        </w:rPr>
-        <w:annotationRef/>
-      </w:r>
-      <w:r>
-        <w:t>A diagram would be great here</w:t>
-      </w:r>
-    </w:p>
-  </w:comment>
-  <w:comment w:id="12" w:author="Adam Dennett" w:date="2026-06-03T19:30:00Z" w:initials="AD">
-    <w:p>
-      <w:pPr>
-        <w:pStyle w:val="CommentText"/>
+        <w:rPr>
+          <w:lang w:val="en-US" w:eastAsia="zh-CN"/>
+        </w:rPr>
       </w:pPr>
       <w:r>
         <w:rPr>
@@ -886,7 +901,6 @@
   <w15:commentEx w15:paraId="0CDB903E" w15:done="0"/>
   <w15:commentEx w15:paraId="5E393F3D" w15:done="0"/>
   <w15:commentEx w15:paraId="553BE126" w15:done="0"/>
-  <w15:commentEx w15:paraId="75394E69" w15:done="0"/>
   <w15:commentEx w15:paraId="0691BDB5" w15:done="0"/>
   <w15:commentEx w15:paraId="5E497142" w15:done="0"/>
   <w15:commentEx w15:paraId="5B477D31" w15:done="0"/>
@@ -915,7 +929,6 @@
   <w16cid:commentId w16cid:paraId="0CDB903E" w16cid:durableId="43CAE86D"/>
   <w16cid:commentId w16cid:paraId="5E393F3D" w16cid:durableId="5934B735"/>
   <w16cid:commentId w16cid:paraId="553BE126" w16cid:durableId="06E871DE"/>
-  <w16cid:commentId w16cid:paraId="75394E69" w16cid:durableId="3E5C5C66"/>
   <w16cid:commentId w16cid:paraId="0691BDB5" w16cid:durableId="60C30C5F"/>
   <w16cid:commentId w16cid:paraId="5E497142" w16cid:durableId="4240FBB2"/>
   <w16cid:commentId w16cid:paraId="5B477D31" w16cid:durableId="485600F2"/>

</xml_diff>